<commit_message>
docs: record watch preview verification and pending production approval
</commit_message>
<xml_diff>
--- a/docs/watch-3.12.0/JackYun-Watch-Implementation-20261013.docx
+++ b/docs/watch-3.12.0/JackYun-Watch-Implementation-20261013.docx
@@ -701,7 +701,7 @@
     </w:p>
     <w:p>
       <w:r>
-        <w:t>在线验收：生产代码尚在发布验证；实际账号登录、刷新、扫码领取及远程撤销需完成线上检查。</w:t>
+        <w:t>在线验收：网页提交 da8453e 的 Vercel 预览已 READY，扫码页 HTTP 200，摄像头仅本站；预览接口按设计未启用。生产发布被自动审批拒绝，待用户明确授权；真实登录、刷新、扫码领取和撤销尚未线上验收。</w:t>
       </w:r>
     </w:p>
     <w:p>
@@ -719,7 +719,7 @@
     </w:p>
     <w:p>
       <w:r>
-        <w:t>先完成兼容性样机项目，再依次验证登录与课表、离线任务、通知已读、专注暂停与重启、提醒去重、远程撤销与账号切换。覆盖午夜、跨周、临时调课、重叠课程、错误密码、验证码过期、二维码重复领取、断网提交与删除冲突。最后执行锁屏、省电及一天使用。任何失败记录设备 API、权限状态、预期与实际时间，再决定修复或调整平台方案。</w:t>
+        <w:t>先通过兼容性测试，再验证登录、课表、离线提交、计时、提醒及撤销。覆盖午夜、跨周、调课、重叠、错误凭证、二维码重复领取和冲突；最后测试锁屏、省电和一天续航。失败时记录设备 API、权限及预期与实际时间。</w:t>
       </w:r>
     </w:p>
     <w:p>

</xml_diff>